<commit_message>
feat: enhance documentation with repository links and styling improvements
</commit_message>
<xml_diff>
--- a/docs/ParcelFlow-API-প্রকল্প-নথি.docx
+++ b/docs/ParcelFlow-API-প্রকল্প-নথি.docx
@@ -500,6 +500,138 @@
           </w:p>
         </w:tc>
       </w:tr>
+      <w:tr>
+        <w:tc>
+          <w:tcPr>
+            <w:tcW w:type="dxa" w:w="2400"/>
+            <w:tcBorders>
+              <w:top w:val="single" w:color="D5DEDB" w:sz="2"/>
+              <w:left w:val="single" w:color="D5DEDB" w:sz="2"/>
+              <w:bottom w:val="single" w:color="D5DEDB" w:sz="2"/>
+              <w:right w:val="single" w:color="D5DEDB" w:sz="2"/>
+            </w:tcBorders>
+            <w:tcMar>
+              <w:top w:type="dxa" w:w="70"/>
+              <w:left w:type="dxa" w:w="110"/>
+              <w:bottom w:type="dxa" w:w="70"/>
+              <w:right w:type="dxa" w:w="110"/>
+            </w:tcMar>
+          </w:tcPr>
+          <w:p>
+            <w:pPr>
+              <w:spacing w:after="0"/>
+            </w:pPr>
+            <w:r>
+              <w:rPr>
+                <w:rFonts w:ascii="Calibri" w:cs="Bangla MN" w:hAnsi="Calibri"/>
+                <w:b/>
+                <w:bCs/>
+              </w:rPr>
+              <w:t xml:space="preserve">Backend repo</w:t>
+            </w:r>
+          </w:p>
+        </w:tc>
+        <w:tc>
+          <w:tcPr>
+            <w:tcW w:type="dxa" w:w="6626"/>
+            <w:tcBorders>
+              <w:top w:val="single" w:color="D5DEDB" w:sz="2"/>
+              <w:left w:val="single" w:color="D5DEDB" w:sz="2"/>
+              <w:bottom w:val="single" w:color="D5DEDB" w:sz="2"/>
+              <w:right w:val="single" w:color="D5DEDB" w:sz="2"/>
+            </w:tcBorders>
+            <w:tcMar>
+              <w:top w:type="dxa" w:w="70"/>
+              <w:left w:type="dxa" w:w="110"/>
+              <w:bottom w:type="dxa" w:w="70"/>
+              <w:right w:type="dxa" w:w="110"/>
+            </w:tcMar>
+          </w:tcPr>
+          <w:p>
+            <w:pPr>
+              <w:spacing w:after="0"/>
+            </w:pPr>
+            <w:hyperlink r:id="rId100">
+              <w:r>
+                <w:rPr>
+                  <w:rFonts w:ascii="Consolas" w:cs="Bangla MN" w:hAnsi="Consolas"/>
+                  <w:color w:val="0C6360"/>
+                  <w:u w:val="single"/>
+                  <w:sz w:val="19"/>
+                  <w:szCs w:val="19"/>
+                </w:rPr>
+                <w:t xml:space="preserve">https://github.com/ALPHAMAN-0/ParcelFlowApi.git</w:t>
+              </w:r>
+            </w:hyperlink>
+          </w:p>
+        </w:tc>
+      </w:tr>
+      <w:tr>
+        <w:tc>
+          <w:tcPr>
+            <w:tcW w:type="dxa" w:w="2400"/>
+            <w:tcBorders>
+              <w:top w:val="single" w:color="D5DEDB" w:sz="2"/>
+              <w:left w:val="single" w:color="D5DEDB" w:sz="2"/>
+              <w:bottom w:val="single" w:color="D5DEDB" w:sz="2"/>
+              <w:right w:val="single" w:color="D5DEDB" w:sz="2"/>
+            </w:tcBorders>
+            <w:tcMar>
+              <w:top w:type="dxa" w:w="70"/>
+              <w:left w:type="dxa" w:w="110"/>
+              <w:bottom w:type="dxa" w:w="70"/>
+              <w:right w:type="dxa" w:w="110"/>
+            </w:tcMar>
+          </w:tcPr>
+          <w:p>
+            <w:pPr>
+              <w:spacing w:after="0"/>
+            </w:pPr>
+            <w:r>
+              <w:rPr>
+                <w:rFonts w:ascii="Calibri" w:cs="Bangla MN" w:hAnsi="Calibri"/>
+                <w:b/>
+                <w:bCs/>
+              </w:rPr>
+              <w:t xml:space="preserve">Frontend repo</w:t>
+            </w:r>
+          </w:p>
+        </w:tc>
+        <w:tc>
+          <w:tcPr>
+            <w:tcW w:type="dxa" w:w="6626"/>
+            <w:tcBorders>
+              <w:top w:val="single" w:color="D5DEDB" w:sz="2"/>
+              <w:left w:val="single" w:color="D5DEDB" w:sz="2"/>
+              <w:bottom w:val="single" w:color="D5DEDB" w:sz="2"/>
+              <w:right w:val="single" w:color="D5DEDB" w:sz="2"/>
+            </w:tcBorders>
+            <w:tcMar>
+              <w:top w:type="dxa" w:w="70"/>
+              <w:left w:type="dxa" w:w="110"/>
+              <w:bottom w:type="dxa" w:w="70"/>
+              <w:right w:type="dxa" w:w="110"/>
+            </w:tcMar>
+          </w:tcPr>
+          <w:p>
+            <w:pPr>
+              <w:spacing w:after="0"/>
+            </w:pPr>
+            <w:hyperlink r:id="rId101">
+              <w:r>
+                <w:rPr>
+                  <w:rFonts w:ascii="Consolas" w:cs="Bangla MN" w:hAnsi="Consolas"/>
+                  <w:color w:val="0C6360"/>
+                  <w:u w:val="single"/>
+                  <w:sz w:val="19"/>
+                  <w:szCs w:val="19"/>
+                </w:rPr>
+                <w:t xml:space="preserve">https://github.com/ALPHAMAN-0/parcelFlow_Frontend.git</w:t>
+              </w:r>
+            </w:hyperlink>
+          </w:p>
+        </w:tc>
+      </w:tr>
     </w:tbl>
     <w:p>
       <w:r>
@@ -675,7 +807,7 @@
         <w:rPr>
           <w:rFonts w:ascii="Calibri" w:cs="Bangla MN" w:hAnsi="Calibri"/>
         </w:rPr>
-        <w:t xml:space="preserve">এটি সচেতনভাবে একটি backend-only প্রকল্প। এতে কোনো user interface নেই, email বা SMS পাঠানোর ব্যবস্থা নেই, payment handling নেই, এবং GPS tracking নেই। এটি একটি নির্দিষ্ট linear delivery pipeline-কে মডেল করে এবং সেই pipeline-এর প্রতিটি পদক্ষেপের নির্ভুল হিসাব রাখে।</w:t>
+        <w:t xml:space="preserve">এই repository-টি সচেতনভাবে backend-only। এখানে কোনো user interface নেই — সেটি আলাদা একটি frontend repository-তে রাখা হয়েছে — email বা SMS পাঠানোর ব্যবস্থা নেই, payment handling নেই, এবং GPS tracking নেই। এটি একটি নির্দিষ্ট linear delivery pipeline-কে মডেল করে এবং সেই pipeline-এর প্রতিটি পদক্ষেপের নির্ভুল হিসাব রাখে।</w:t>
       </w:r>
     </w:p>
     <w:p>

</xml_diff>

<commit_message>
Refactor code structure for improved readability and maintainability
</commit_message>
<xml_diff>
--- a/docs/ParcelFlow-API-প্রকল্প-নথি.docx
+++ b/docs/ParcelFlow-API-প্রকল্প-নথি.docx
@@ -1759,7 +1759,1397 @@
           <w:sz w:val="16"/>
           <w:szCs w:val="16"/>
         </w:rPr>
-        <w:t xml:space="preserve">০৪ / ARCHITECTURE</w:t>
+        <w:t xml:space="preserve">০৪ / INTERFACE</w:t>
+      </w:r>
+    </w:p>
+    <w:p>
+      <w:pPr>
+        <w:pStyle w:val="Heading1"/>
+        <w:spacing w:after="180" w:before="0"/>
+      </w:pPr>
+      <w:r>
+        <w:rPr>
+          <w:rFonts w:ascii="Calibri" w:cs="Bangla MN" w:hAnsi="Calibri"/>
+          <w:b/>
+          <w:bCs/>
+          <w:color w:val="101E21"/>
+          <w:sz w:val="32"/>
+          <w:szCs w:val="32"/>
+        </w:rPr>
+        <w:t xml:space="preserve">ফ্রন্টএন্ড ইন্টারফেস</w:t>
+      </w:r>
+    </w:p>
+    <w:p>
+      <w:pPr>
+        <w:spacing w:after="150"/>
+      </w:pPr>
+      <w:r>
+        <w:rPr>
+          <w:rFonts w:ascii="Calibri" w:cs="Bangla MN" w:hAnsi="Calibri"/>
+        </w:rPr>
+        <w:t xml:space="preserve">API-টি নিজে headless — এর কোনো পাতা নেই, শুধু JSON আছে। কিন্তু নিয়মগুলো বাস্তবে কেমন দাঁড়ায় তা দেখানোর জন্য একটি আলাদা React (Vite) ক্লায়েন্ট তৈরি করা হয়েছে এবং Vercel-এ স্থাপন করা হয়েছে। এটি ঠিক সেই একই </w:t>
+      </w:r>
+      <w:r>
+        <w:rPr>
+          <w:rFonts w:ascii="Consolas" w:cs="Bangla MN" w:hAnsi="Consolas"/>
+        </w:rPr>
+        <w:t xml:space="preserve">/api/v1</w:t>
+      </w:r>
+      <w:r>
+        <w:rPr>
+          <w:rFonts w:ascii="Calibri" w:cs="Bangla MN" w:hAnsi="Calibri"/>
+        </w:rPr>
+        <w:t xml:space="preserve"> endpoint-গুলোই ব্যবহার করে যেগুলো এই নথিতে বর্ণনা করা হয়েছে — আলাদা কোনো সুবিধা বা shortcut নেই।</w:t>
+      </w:r>
+    </w:p>
+    <w:p>
+      <w:pPr>
+        <w:spacing w:after="200"/>
+      </w:pPr>
+      <w:r>
+        <w:rPr>
+          <w:rFonts w:ascii="Calibri" w:cs="Bangla MN" w:hAnsi="Calibri"/>
+        </w:rPr>
+        <w:t xml:space="preserve">নিচের প্রতিটি ছবি চালু অ্যাপ থেকে নেওয়া স্ক্রিনশট — কোনোটিই আঁকা বা সাজানো নয়। পর্দায় যত সংখ্যা, tracking code ও নাম দেখা যাচ্ছে সবই seed করা ডেটা থেকে live API হয়ে এসেছে। অ্যাপ: parcel-flow-frontend.vercel.app · কোড: github.com/ALPHAMAN-0/parcelFlow_Frontend</w:t>
+      </w:r>
+    </w:p>
+    <w:p>
+      <w:pPr>
+        <w:pStyle w:val="Heading2"/>
+        <w:spacing w:after="140" w:before="300"/>
+      </w:pPr>
+      <w:r>
+        <w:rPr>
+          <w:rFonts w:ascii="Calibri" w:cs="Bangla MN" w:hAnsi="Calibri"/>
+          <w:b/>
+          <w:bCs/>
+          <w:color w:val="101E21"/>
+          <w:sz w:val="24"/>
+          <w:szCs w:val="24"/>
+        </w:rPr>
+        <w:t xml:space="preserve">প্রবেশের আগে</w:t>
+      </w:r>
+    </w:p>
+    <w:p>
+      <w:pPr>
+        <w:spacing w:after="100" w:before="200"/>
+        <w:jc w:val="center"/>
+      </w:pPr>
+      <w:r>
+        <w:drawing>
+          <wp:inline distT="0" distB="0" distL="0" distR="0">
+            <wp:extent cx="7863840" cy="5250269"/>
+            <wp:effectExtent t="0" r="0" b="0" l="0"/>
+            <wp:docPr id="601" name="" descr="" title=""/>
+            <wp:cNvGraphicFramePr>
+              <a:graphicFrameLocks xmlns:a="http://schemas.openxmlformats.org/drawingml/2006/main" noChangeAspect="1"/>
+            </wp:cNvGraphicFramePr>
+            <a:graphic xmlns:a="http://schemas.openxmlformats.org/drawingml/2006/main">
+              <a:graphicData uri="http://schemas.openxmlformats.org/drawingml/2006/picture">
+                <pic:pic xmlns:pic="http://schemas.openxmlformats.org/drawingml/2006/picture">
+                  <pic:nvPicPr>
+                    <pic:cNvPr id="0" name="" descr=""/>
+                    <pic:cNvPicPr>
+                      <a:picLocks noChangeAspect="1" noChangeArrowheads="1"/>
+                    </pic:cNvPicPr>
+                  </pic:nvPicPr>
+                  <pic:blipFill>
+                    <a:blip r:embed="rId200" cstate="none"/>
+                    <a:srcRect/>
+                    <a:stretch>
+                      <a:fillRect/>
+                    </a:stretch>
+                  </pic:blipFill>
+                  <pic:spPr bwMode="auto">
+                    <a:xfrm>
+                      <a:off x="0" y="0"/>
+                      <a:ext cx="7863840" cy="5250269"/>
+                    </a:xfrm>
+                    <a:prstGeom prst="rect">
+                      <a:avLst/>
+                    </a:prstGeom>
+                  </pic:spPr>
+                </pic:pic>
+              </a:graphicData>
+            </a:graphic>
+          </wp:inline>
+        </w:drawing>
+      </w:r>
+    </w:p>
+    <w:p>
+      <w:pPr>
+        <w:spacing w:after="280" w:line="260"/>
+        <w:jc w:val="left"/>
+      </w:pPr>
+      <w:r>
+        <w:rPr>
+          <w:rFonts w:ascii="Calibri" w:cs="Bangla MN" w:hAnsi="Calibri"/>
+          <w:b/>
+          <w:bCs/>
+          <w:color w:val="101E21"/>
+          <w:sz w:val="18"/>
+          <w:szCs w:val="18"/>
+        </w:rPr>
+        <w:t xml:space="preserve">চিত্র ১ — সাইন-ইন করার আগের পাতা।</w:t>
+      </w:r>
+      <w:r>
+        <w:rPr>
+          <w:rFonts w:ascii="Calibri" w:cs="Bangla MN" w:hAnsi="Calibri"/>
+          <w:color w:val="4A5D60"/>
+          <w:sz w:val="18"/>
+          <w:szCs w:val="18"/>
+        </w:rPr>
+        <w:t xml:space="preserve"> status flow-এর পাঁচটি ধাপ এবং কোন ভূমিকা কী দেখতে পায় — দুটোই এখানে বলা আছে, ফলে অ্যাকাউন্ট না খুলেও সিস্টেমের নিয়মগুলো বোঝা যায়।</w:t>
+      </w:r>
+    </w:p>
+    <w:p>
+      <w:pPr>
+        <w:pStyle w:val="Heading2"/>
+        <w:spacing w:after="140" w:before="300"/>
+      </w:pPr>
+      <w:r>
+        <w:rPr>
+          <w:rFonts w:ascii="Calibri" w:cs="Bangla MN" w:hAnsi="Calibri"/>
+          <w:b/>
+          <w:bCs/>
+          <w:color w:val="101E21"/>
+          <w:sz w:val="24"/>
+          <w:szCs w:val="24"/>
+        </w:rPr>
+        <w:t xml:space="preserve">একই ডেটা, তিনটি ভিন্ন দৃশ্য</w:t>
+      </w:r>
+    </w:p>
+    <w:p>
+      <w:pPr>
+        <w:spacing w:after="150"/>
+      </w:pPr>
+      <w:r>
+        <w:rPr>
+          <w:rFonts w:ascii="Calibri" w:cs="Bangla MN" w:hAnsi="Calibri"/>
+        </w:rPr>
+        <w:t xml:space="preserve">নিচের তিনটি dashboard একই সিস্টেমের, একই সময়ের। পার্থক্যটি সামনের দিকে filter করে তৈরি নয় — কে কোন row দেখতে পাবে সেটি database query-তেই ঠিক হয়ে যায়, তাই নিজের scope-এর বাইরের কোনো পার্সেল ব্রাউজার পর্যন্ত পৌঁছায়ই না।</w:t>
+      </w:r>
+    </w:p>
+    <w:tbl>
+      <w:tblPr>
+        <w:tblW w:type="dxa" w:w="14340"/>
+        <w:jc w:val="center"/>
+        <w:tblBorders>
+          <w:top w:val="none" w:sz="0"/>
+          <w:left w:val="none" w:sz="0"/>
+          <w:bottom w:val="none" w:sz="0"/>
+          <w:right w:val="none" w:sz="0"/>
+          <w:insideH w:val="none" w:sz="0"/>
+          <w:insideV w:val="none" w:sz="0"/>
+        </w:tblBorders>
+      </w:tblPr>
+      <w:tblGrid>
+        <w:gridCol w:w="4780"/>
+        <w:gridCol w:w="4780"/>
+        <w:gridCol w:w="4780"/>
+      </w:tblGrid>
+      <w:tr>
+        <w:tc>
+          <w:tcPr>
+            <w:tcW w:type="dxa" w:w="4780"/>
+            <w:tcMar>
+              <w:top w:type="dxa" w:w="40"/>
+              <w:left w:type="dxa" w:w="60"/>
+              <w:bottom w:type="dxa" w:w="40"/>
+              <w:right w:type="dxa" w:w="60"/>
+            </w:tcMar>
+          </w:tcPr>
+          <w:p>
+            <w:pPr>
+              <w:spacing w:after="60" w:before="60"/>
+              <w:jc w:val="center"/>
+            </w:pPr>
+            <w:r>
+              <w:drawing>
+                <wp:inline distT="0" distB="0" distL="0" distR="0">
+                  <wp:extent cx="2788920" cy="1862998"/>
+                  <wp:effectExtent t="0" r="0" b="0" l="0"/>
+                  <wp:docPr id="602" name="" descr="" title=""/>
+                  <wp:cNvGraphicFramePr>
+                    <a:graphicFrameLocks xmlns:a="http://schemas.openxmlformats.org/drawingml/2006/main" noChangeAspect="1"/>
+                  </wp:cNvGraphicFramePr>
+                  <a:graphic xmlns:a="http://schemas.openxmlformats.org/drawingml/2006/main">
+                    <a:graphicData uri="http://schemas.openxmlformats.org/drawingml/2006/picture">
+                      <pic:pic xmlns:pic="http://schemas.openxmlformats.org/drawingml/2006/picture">
+                        <pic:nvPicPr>
+                          <pic:cNvPr id="0" name="" descr=""/>
+                          <pic:cNvPicPr>
+                            <a:picLocks noChangeAspect="1" noChangeArrowheads="1"/>
+                          </pic:cNvPicPr>
+                        </pic:nvPicPr>
+                        <pic:blipFill>
+                          <a:blip r:embed="rId201" cstate="none"/>
+                          <a:srcRect/>
+                          <a:stretch>
+                            <a:fillRect/>
+                          </a:stretch>
+                        </pic:blipFill>
+                        <pic:spPr bwMode="auto">
+                          <a:xfrm>
+                            <a:off x="0" y="0"/>
+                            <a:ext cx="2788920" cy="1862998"/>
+                          </a:xfrm>
+                          <a:prstGeom prst="rect">
+                            <a:avLst/>
+                          </a:prstGeom>
+                        </pic:spPr>
+                      </pic:pic>
+                    </a:graphicData>
+                  </a:graphic>
+                </wp:inline>
+              </w:drawing>
+            </w:r>
+          </w:p>
+          <w:p>
+            <w:pPr>
+              <w:spacing w:after="60" w:line="260"/>
+              <w:jc w:val="left"/>
+            </w:pPr>
+            <w:r>
+              <w:rPr>
+                <w:rFonts w:ascii="Calibri" w:cs="Bangla MN" w:hAnsi="Calibri"/>
+                <w:b/>
+                <w:bCs/>
+                <w:color w:val="101E21"/>
+                <w:sz w:val="18"/>
+                <w:szCs w:val="18"/>
+              </w:rPr>
+              <w:t xml:space="preserve">Admin।</w:t>
+            </w:r>
+            <w:r>
+              <w:rPr>
+                <w:rFonts w:ascii="Calibri" w:cs="Bangla MN" w:hAnsi="Calibri"/>
+                <w:color w:val="4A5D60"/>
+                <w:sz w:val="18"/>
+                <w:szCs w:val="18"/>
+              </w:rPr>
+              <w:t xml:space="preserve"> পুরো সিস্টেমের হিসাব — ৯টি পার্সেল, ৩টি এখনো courier ছাড়া, delivery rate ৩৩.৩%।</w:t>
+            </w:r>
+          </w:p>
+        </w:tc>
+        <w:tc>
+          <w:tcPr>
+            <w:tcW w:type="dxa" w:w="4780"/>
+            <w:tcMar>
+              <w:top w:type="dxa" w:w="40"/>
+              <w:left w:type="dxa" w:w="60"/>
+              <w:bottom w:type="dxa" w:w="40"/>
+              <w:right w:type="dxa" w:w="60"/>
+            </w:tcMar>
+          </w:tcPr>
+          <w:p>
+            <w:pPr>
+              <w:spacing w:after="60" w:before="60"/>
+              <w:jc w:val="center"/>
+            </w:pPr>
+            <w:r>
+              <w:drawing>
+                <wp:inline distT="0" distB="0" distL="0" distR="0">
+                  <wp:extent cx="2788920" cy="1862998"/>
+                  <wp:effectExtent t="0" r="0" b="0" l="0"/>
+                  <wp:docPr id="603" name="" descr="" title=""/>
+                  <wp:cNvGraphicFramePr>
+                    <a:graphicFrameLocks xmlns:a="http://schemas.openxmlformats.org/drawingml/2006/main" noChangeAspect="1"/>
+                  </wp:cNvGraphicFramePr>
+                  <a:graphic xmlns:a="http://schemas.openxmlformats.org/drawingml/2006/main">
+                    <a:graphicData uri="http://schemas.openxmlformats.org/drawingml/2006/picture">
+                      <pic:pic xmlns:pic="http://schemas.openxmlformats.org/drawingml/2006/picture">
+                        <pic:nvPicPr>
+                          <pic:cNvPr id="0" name="" descr=""/>
+                          <pic:cNvPicPr>
+                            <a:picLocks noChangeAspect="1" noChangeArrowheads="1"/>
+                          </pic:cNvPicPr>
+                        </pic:nvPicPr>
+                        <pic:blipFill>
+                          <a:blip r:embed="rId202" cstate="none"/>
+                          <a:srcRect/>
+                          <a:stretch>
+                            <a:fillRect/>
+                          </a:stretch>
+                        </pic:blipFill>
+                        <pic:spPr bwMode="auto">
+                          <a:xfrm>
+                            <a:off x="0" y="0"/>
+                            <a:ext cx="2788920" cy="1862998"/>
+                          </a:xfrm>
+                          <a:prstGeom prst="rect">
+                            <a:avLst/>
+                          </a:prstGeom>
+                        </pic:spPr>
+                      </pic:pic>
+                    </a:graphicData>
+                  </a:graphic>
+                </wp:inline>
+              </w:drawing>
+            </w:r>
+          </w:p>
+          <w:p>
+            <w:pPr>
+              <w:spacing w:after="60" w:line="260"/>
+              <w:jc w:val="left"/>
+            </w:pPr>
+            <w:r>
+              <w:rPr>
+                <w:rFonts w:ascii="Calibri" w:cs="Bangla MN" w:hAnsi="Calibri"/>
+                <w:b/>
+                <w:bCs/>
+                <w:color w:val="101E21"/>
+                <w:sz w:val="18"/>
+                <w:szCs w:val="18"/>
+              </w:rPr>
+              <w:t xml:space="preserve">Delivery staff।</w:t>
+            </w:r>
+            <w:r>
+              <w:rPr>
+                <w:rFonts w:ascii="Calibri" w:cs="Bangla MN" w:hAnsi="Calibri"/>
+                <w:color w:val="4A5D60"/>
+                <w:sz w:val="18"/>
+                <w:szCs w:val="18"/>
+              </w:rPr>
+              <w:t xml:space="preserve"> শুধু নিজের উপর assign করা ৪টি পার্সেল, আর পরের কোন পদক্ষেপ কোথায় বাকি।</w:t>
+            </w:r>
+          </w:p>
+        </w:tc>
+        <w:tc>
+          <w:tcPr>
+            <w:tcW w:type="dxa" w:w="4780"/>
+            <w:tcMar>
+              <w:top w:type="dxa" w:w="40"/>
+              <w:left w:type="dxa" w:w="60"/>
+              <w:bottom w:type="dxa" w:w="40"/>
+              <w:right w:type="dxa" w:w="60"/>
+            </w:tcMar>
+          </w:tcPr>
+          <w:p>
+            <w:pPr>
+              <w:spacing w:after="60" w:before="60"/>
+              <w:jc w:val="center"/>
+            </w:pPr>
+            <w:r>
+              <w:drawing>
+                <wp:inline distT="0" distB="0" distL="0" distR="0">
+                  <wp:extent cx="2788920" cy="1862998"/>
+                  <wp:effectExtent t="0" r="0" b="0" l="0"/>
+                  <wp:docPr id="604" name="" descr="" title=""/>
+                  <wp:cNvGraphicFramePr>
+                    <a:graphicFrameLocks xmlns:a="http://schemas.openxmlformats.org/drawingml/2006/main" noChangeAspect="1"/>
+                  </wp:cNvGraphicFramePr>
+                  <a:graphic xmlns:a="http://schemas.openxmlformats.org/drawingml/2006/main">
+                    <a:graphicData uri="http://schemas.openxmlformats.org/drawingml/2006/picture">
+                      <pic:pic xmlns:pic="http://schemas.openxmlformats.org/drawingml/2006/picture">
+                        <pic:nvPicPr>
+                          <pic:cNvPr id="0" name="" descr=""/>
+                          <pic:cNvPicPr>
+                            <a:picLocks noChangeAspect="1" noChangeArrowheads="1"/>
+                          </pic:cNvPicPr>
+                        </pic:nvPicPr>
+                        <pic:blipFill>
+                          <a:blip r:embed="rId203" cstate="none"/>
+                          <a:srcRect/>
+                          <a:stretch>
+                            <a:fillRect/>
+                          </a:stretch>
+                        </pic:blipFill>
+                        <pic:spPr bwMode="auto">
+                          <a:xfrm>
+                            <a:off x="0" y="0"/>
+                            <a:ext cx="2788920" cy="1862998"/>
+                          </a:xfrm>
+                          <a:prstGeom prst="rect">
+                            <a:avLst/>
+                          </a:prstGeom>
+                        </pic:spPr>
+                      </pic:pic>
+                    </a:graphicData>
+                  </a:graphic>
+                </wp:inline>
+              </w:drawing>
+            </w:r>
+          </w:p>
+          <w:p>
+            <w:pPr>
+              <w:spacing w:after="60" w:line="260"/>
+              <w:jc w:val="left"/>
+            </w:pPr>
+            <w:r>
+              <w:rPr>
+                <w:rFonts w:ascii="Calibri" w:cs="Bangla MN" w:hAnsi="Calibri"/>
+                <w:b/>
+                <w:bCs/>
+                <w:color w:val="101E21"/>
+                <w:sz w:val="18"/>
+                <w:szCs w:val="18"/>
+              </w:rPr>
+              <w:t xml:space="preserve">Customer।</w:t>
+            </w:r>
+            <w:r>
+              <w:rPr>
+                <w:rFonts w:ascii="Calibri" w:cs="Bangla MN" w:hAnsi="Calibri"/>
+                <w:color w:val="4A5D60"/>
+                <w:sz w:val="18"/>
+                <w:szCs w:val="18"/>
+              </w:rPr>
+              <w:t xml:space="preserve"> শুধু নিজের বুক করা ৫টি পার্সেল, অন্য কারও কিছু নয়।</w:t>
+            </w:r>
+          </w:p>
+        </w:tc>
+      </w:tr>
+    </w:tbl>
+    <w:p>
+      <w:pPr>
+        <w:spacing w:after="200"/>
+      </w:pPr>
+    </w:p>
+    <w:p>
+      <w:pPr>
+        <w:pStyle w:val="Heading2"/>
+        <w:spacing w:after="140" w:before="300"/>
+      </w:pPr>
+      <w:r>
+        <w:rPr>
+          <w:rFonts w:ascii="Calibri" w:cs="Bangla MN" w:hAnsi="Calibri"/>
+          <w:b/>
+          <w:bCs/>
+          <w:color w:val="101E21"/>
+          <w:sz w:val="24"/>
+          <w:szCs w:val="24"/>
+        </w:rPr>
+        <w:t xml:space="preserve">পার্সেলের জীবনচক্র</w:t>
+      </w:r>
+    </w:p>
+    <w:p>
+      <w:pPr>
+        <w:spacing w:after="100" w:before="200"/>
+        <w:jc w:val="center"/>
+      </w:pPr>
+      <w:r>
+        <w:drawing>
+          <wp:inline distT="0" distB="0" distL="0" distR="0">
+            <wp:extent cx="7863840" cy="5250269"/>
+            <wp:effectExtent t="0" r="0" b="0" l="0"/>
+            <wp:docPr id="605" name="" descr="" title=""/>
+            <wp:cNvGraphicFramePr>
+              <a:graphicFrameLocks xmlns:a="http://schemas.openxmlformats.org/drawingml/2006/main" noChangeAspect="1"/>
+            </wp:cNvGraphicFramePr>
+            <a:graphic xmlns:a="http://schemas.openxmlformats.org/drawingml/2006/main">
+              <a:graphicData uri="http://schemas.openxmlformats.org/drawingml/2006/picture">
+                <pic:pic xmlns:pic="http://schemas.openxmlformats.org/drawingml/2006/picture">
+                  <pic:nvPicPr>
+                    <pic:cNvPr id="0" name="" descr=""/>
+                    <pic:cNvPicPr>
+                      <a:picLocks noChangeAspect="1" noChangeArrowheads="1"/>
+                    </pic:cNvPicPr>
+                  </pic:nvPicPr>
+                  <pic:blipFill>
+                    <a:blip r:embed="rId204" cstate="none"/>
+                    <a:srcRect/>
+                    <a:stretch>
+                      <a:fillRect/>
+                    </a:stretch>
+                  </pic:blipFill>
+                  <pic:spPr bwMode="auto">
+                    <a:xfrm>
+                      <a:off x="0" y="0"/>
+                      <a:ext cx="7863840" cy="5250269"/>
+                    </a:xfrm>
+                    <a:prstGeom prst="rect">
+                      <a:avLst/>
+                    </a:prstGeom>
+                  </pic:spPr>
+                </pic:pic>
+              </a:graphicData>
+            </a:graphic>
+          </wp:inline>
+        </w:drawing>
+      </w:r>
+    </w:p>
+    <w:p>
+      <w:pPr>
+        <w:spacing w:after="280" w:line="260"/>
+        <w:jc w:val="left"/>
+      </w:pPr>
+      <w:r>
+        <w:rPr>
+          <w:rFonts w:ascii="Calibri" w:cs="Bangla MN" w:hAnsi="Calibri"/>
+          <w:b/>
+          <w:bCs/>
+          <w:color w:val="101E21"/>
+          <w:sz w:val="18"/>
+          <w:szCs w:val="18"/>
+        </w:rPr>
+        <w:t xml:space="preserve">চিত্র ২ — পার্সেল তালিকা (admin)।</w:t>
+      </w:r>
+      <w:r>
+        <w:rPr>
+          <w:rFonts w:ascii="Calibri" w:cs="Bangla MN" w:hAnsi="Calibri"/>
+          <w:color w:val="4A5D60"/>
+          <w:sz w:val="18"/>
+          <w:szCs w:val="18"/>
+        </w:rPr>
+        <w:t xml:space="preserve"> Status, tracking code, pickup ও delivery এলাকা, sort ও per-page — প্রতিটি filter server-side। ডান পাশে প্রতিটি সারিতে কেবল পরবর্তী বৈধ transition-টিই বোতাম হিসেবে থাকে, তাই state machine ভাঙার সুযোগ ইন্টারফেসেই তৈরি হয় না।</w:t>
+      </w:r>
+    </w:p>
+    <w:p>
+      <w:pPr>
+        <w:spacing w:after="100" w:before="200"/>
+        <w:jc w:val="center"/>
+      </w:pPr>
+      <w:r>
+        <w:drawing>
+          <wp:inline distT="0" distB="0" distL="0" distR="0">
+            <wp:extent cx="7863840" cy="5250269"/>
+            <wp:effectExtent t="0" r="0" b="0" l="0"/>
+            <wp:docPr id="606" name="" descr="" title=""/>
+            <wp:cNvGraphicFramePr>
+              <a:graphicFrameLocks xmlns:a="http://schemas.openxmlformats.org/drawingml/2006/main" noChangeAspect="1"/>
+            </wp:cNvGraphicFramePr>
+            <a:graphic xmlns:a="http://schemas.openxmlformats.org/drawingml/2006/main">
+              <a:graphicData uri="http://schemas.openxmlformats.org/drawingml/2006/picture">
+                <pic:pic xmlns:pic="http://schemas.openxmlformats.org/drawingml/2006/picture">
+                  <pic:nvPicPr>
+                    <pic:cNvPr id="0" name="" descr=""/>
+                    <pic:cNvPicPr>
+                      <a:picLocks noChangeAspect="1" noChangeArrowheads="1"/>
+                    </pic:cNvPicPr>
+                  </pic:nvPicPr>
+                  <pic:blipFill>
+                    <a:blip r:embed="rId205" cstate="none"/>
+                    <a:srcRect/>
+                    <a:stretch>
+                      <a:fillRect/>
+                    </a:stretch>
+                  </pic:blipFill>
+                  <pic:spPr bwMode="auto">
+                    <a:xfrm>
+                      <a:off x="0" y="0"/>
+                      <a:ext cx="7863840" cy="5250269"/>
+                    </a:xfrm>
+                    <a:prstGeom prst="rect">
+                      <a:avLst/>
+                    </a:prstGeom>
+                  </pic:spPr>
+                </pic:pic>
+              </a:graphicData>
+            </a:graphic>
+          </wp:inline>
+        </w:drawing>
+      </w:r>
+    </w:p>
+    <w:p>
+      <w:pPr>
+        <w:spacing w:after="280" w:line="260"/>
+        <w:jc w:val="left"/>
+      </w:pPr>
+      <w:r>
+        <w:rPr>
+          <w:rFonts w:ascii="Calibri" w:cs="Bangla MN" w:hAnsi="Calibri"/>
+          <w:b/>
+          <w:bCs/>
+          <w:color w:val="101E21"/>
+          <w:sz w:val="18"/>
+          <w:szCs w:val="18"/>
+        </w:rPr>
+        <w:t xml:space="preserve">চিত্র ৩ — পার্সেলের বিস্তারিত ও ইতিহাস।</w:t>
+      </w:r>
+      <w:r>
+        <w:rPr>
+          <w:rFonts w:ascii="Calibri" w:cs="Bangla MN" w:hAnsi="Calibri"/>
+          <w:color w:val="4A5D60"/>
+          <w:sz w:val="18"/>
+          <w:szCs w:val="18"/>
+        </w:rPr>
+        <w:t xml:space="preserve"> উপরে পাঁচ ধাপের অগ্রগতি, নিচে append-only history — কে, কখন, কোন transition করেছে। এই তালিকা কখনো সম্পাদনা বা মোছা হয় না; নতুন সারি যোগ হওয়াই এর একমাত্র পরিবর্তন।</w:t>
+      </w:r>
+    </w:p>
+    <w:tbl>
+      <w:tblPr>
+        <w:tblW w:type="dxa" w:w="14340"/>
+        <w:jc w:val="center"/>
+        <w:tblBorders>
+          <w:top w:val="none" w:sz="0"/>
+          <w:left w:val="none" w:sz="0"/>
+          <w:bottom w:val="none" w:sz="0"/>
+          <w:right w:val="none" w:sz="0"/>
+          <w:insideH w:val="none" w:sz="0"/>
+          <w:insideV w:val="none" w:sz="0"/>
+        </w:tblBorders>
+      </w:tblPr>
+      <w:tblGrid>
+        <w:gridCol w:w="7170"/>
+        <w:gridCol w:w="7170"/>
+      </w:tblGrid>
+      <w:tr>
+        <w:tc>
+          <w:tcPr>
+            <w:tcW w:type="dxa" w:w="7170"/>
+            <w:tcMar>
+              <w:top w:type="dxa" w:w="40"/>
+              <w:left w:type="dxa" w:w="60"/>
+              <w:bottom w:type="dxa" w:w="40"/>
+              <w:right w:type="dxa" w:w="60"/>
+            </w:tcMar>
+          </w:tcPr>
+          <w:p>
+            <w:pPr>
+              <w:spacing w:after="60" w:before="60"/>
+              <w:jc w:val="center"/>
+            </w:pPr>
+            <w:r>
+              <w:drawing>
+                <wp:inline distT="0" distB="0" distL="0" distR="0">
+                  <wp:extent cx="4206240" cy="2806403"/>
+                  <wp:effectExtent t="0" r="0" b="0" l="0"/>
+                  <wp:docPr id="607" name="" descr="" title=""/>
+                  <wp:cNvGraphicFramePr>
+                    <a:graphicFrameLocks xmlns:a="http://schemas.openxmlformats.org/drawingml/2006/main" noChangeAspect="1"/>
+                  </wp:cNvGraphicFramePr>
+                  <a:graphic xmlns:a="http://schemas.openxmlformats.org/drawingml/2006/main">
+                    <a:graphicData uri="http://schemas.openxmlformats.org/drawingml/2006/picture">
+                      <pic:pic xmlns:pic="http://schemas.openxmlformats.org/drawingml/2006/picture">
+                        <pic:nvPicPr>
+                          <pic:cNvPr id="0" name="" descr=""/>
+                          <pic:cNvPicPr>
+                            <a:picLocks noChangeAspect="1" noChangeArrowheads="1"/>
+                          </pic:cNvPicPr>
+                        </pic:nvPicPr>
+                        <pic:blipFill>
+                          <a:blip r:embed="rId208" cstate="none"/>
+                          <a:srcRect/>
+                          <a:stretch>
+                            <a:fillRect/>
+                          </a:stretch>
+                        </pic:blipFill>
+                        <pic:spPr bwMode="auto">
+                          <a:xfrm>
+                            <a:off x="0" y="0"/>
+                            <a:ext cx="4206240" cy="2806403"/>
+                          </a:xfrm>
+                          <a:prstGeom prst="rect">
+                            <a:avLst/>
+                          </a:prstGeom>
+                        </pic:spPr>
+                      </pic:pic>
+                    </a:graphicData>
+                  </a:graphic>
+                </wp:inline>
+              </w:drawing>
+            </w:r>
+          </w:p>
+          <w:p>
+            <w:pPr>
+              <w:spacing w:after="60" w:line="260"/>
+              <w:jc w:val="left"/>
+            </w:pPr>
+            <w:r>
+              <w:rPr>
+                <w:rFonts w:ascii="Calibri" w:cs="Bangla MN" w:hAnsi="Calibri"/>
+                <w:b/>
+                <w:bCs/>
+                <w:color w:val="101E21"/>
+                <w:sz w:val="18"/>
+                <w:szCs w:val="18"/>
+              </w:rPr>
+              <w:t xml:space="preserve">নতুন পার্সেল।</w:t>
+            </w:r>
+            <w:r>
+              <w:rPr>
+                <w:rFonts w:ascii="Calibri" w:cs="Bangla MN" w:hAnsi="Calibri"/>
+                <w:color w:val="4A5D60"/>
+                <w:sz w:val="18"/>
+                <w:szCs w:val="18"/>
+              </w:rPr>
+              <w:t xml:space="preserve"> পার্সেলটি PENDING অবস্থায় তৈরি হয়, tracking code তৈরি হয় server-এ, এবং প্রথম history সারিটি একই transaction-এ লেখা হয়।</w:t>
+            </w:r>
+          </w:p>
+        </w:tc>
+        <w:tc>
+          <w:tcPr>
+            <w:tcW w:type="dxa" w:w="7170"/>
+            <w:tcMar>
+              <w:top w:type="dxa" w:w="40"/>
+              <w:left w:type="dxa" w:w="60"/>
+              <w:bottom w:type="dxa" w:w="40"/>
+              <w:right w:type="dxa" w:w="60"/>
+            </w:tcMar>
+          </w:tcPr>
+          <w:p>
+            <w:pPr>
+              <w:spacing w:after="60" w:before="60"/>
+              <w:jc w:val="center"/>
+            </w:pPr>
+            <w:r>
+              <w:drawing>
+                <wp:inline distT="0" distB="0" distL="0" distR="0">
+                  <wp:extent cx="4206240" cy="2806403"/>
+                  <wp:effectExtent t="0" r="0" b="0" l="0"/>
+                  <wp:docPr id="608" name="" descr="" title=""/>
+                  <wp:cNvGraphicFramePr>
+                    <a:graphicFrameLocks xmlns:a="http://schemas.openxmlformats.org/drawingml/2006/main" noChangeAspect="1"/>
+                  </wp:cNvGraphicFramePr>
+                  <a:graphic xmlns:a="http://schemas.openxmlformats.org/drawingml/2006/main">
+                    <a:graphicData uri="http://schemas.openxmlformats.org/drawingml/2006/picture">
+                      <pic:pic xmlns:pic="http://schemas.openxmlformats.org/drawingml/2006/picture">
+                        <pic:nvPicPr>
+                          <pic:cNvPr id="0" name="" descr=""/>
+                          <pic:cNvPicPr>
+                            <a:picLocks noChangeAspect="1" noChangeArrowheads="1"/>
+                          </pic:cNvPicPr>
+                        </pic:nvPicPr>
+                        <pic:blipFill>
+                          <a:blip r:embed="rId207" cstate="none"/>
+                          <a:srcRect/>
+                          <a:stretch>
+                            <a:fillRect/>
+                          </a:stretch>
+                        </pic:blipFill>
+                        <pic:spPr bwMode="auto">
+                          <a:xfrm>
+                            <a:off x="0" y="0"/>
+                            <a:ext cx="4206240" cy="2806403"/>
+                          </a:xfrm>
+                          <a:prstGeom prst="rect">
+                            <a:avLst/>
+                          </a:prstGeom>
+                        </pic:spPr>
+                      </pic:pic>
+                    </a:graphicData>
+                  </a:graphic>
+                </wp:inline>
+              </w:drawing>
+            </w:r>
+          </w:p>
+          <w:p>
+            <w:pPr>
+              <w:spacing w:after="60" w:line="260"/>
+              <w:jc w:val="left"/>
+            </w:pPr>
+            <w:r>
+              <w:rPr>
+                <w:rFonts w:ascii="Calibri" w:cs="Bangla MN" w:hAnsi="Calibri"/>
+                <w:b/>
+                <w:bCs/>
+                <w:color w:val="101E21"/>
+                <w:sz w:val="18"/>
+                <w:szCs w:val="18"/>
+              </w:rPr>
+              <w:t xml:space="preserve">ব্যবহারকারী ব্যবস্থাপনা।</w:t>
+            </w:r>
+            <w:r>
+              <w:rPr>
+                <w:rFonts w:ascii="Calibri" w:cs="Bangla MN" w:hAnsi="Calibri"/>
+                <w:color w:val="4A5D60"/>
+                <w:sz w:val="18"/>
+                <w:szCs w:val="18"/>
+              </w:rPr>
+              <w:t xml:space="preserve"> ভূমিকা বদলানো যায়, কিন্তু নিজের ভূমিকা নয় — নিয়মটি API-তে প্রয়োগ করা, ইন্টারফেস শুধু তা মেনে চলে।</w:t>
+            </w:r>
+          </w:p>
+        </w:tc>
+      </w:tr>
+    </w:tbl>
+    <w:p>
+      <w:pPr>
+        <w:spacing w:after="200"/>
+      </w:pPr>
+    </w:p>
+    <w:p>
+      <w:pPr>
+        <w:pStyle w:val="Heading2"/>
+        <w:spacing w:after="140" w:before="300"/>
+      </w:pPr>
+      <w:r>
+        <w:rPr>
+          <w:rFonts w:ascii="Calibri" w:cs="Bangla MN" w:hAnsi="Calibri"/>
+          <w:b/>
+          <w:bCs/>
+          <w:color w:val="101E21"/>
+          <w:sz w:val="24"/>
+          <w:szCs w:val="24"/>
+        </w:rPr>
+        <w:t xml:space="preserve">প্রশাসনিক দৃশ্য</w:t>
+      </w:r>
+    </w:p>
+    <w:p>
+      <w:pPr>
+        <w:spacing w:after="100" w:before="200"/>
+        <w:jc w:val="center"/>
+      </w:pPr>
+      <w:r>
+        <w:drawing>
+          <wp:inline distT="0" distB="0" distL="0" distR="0">
+            <wp:extent cx="7863840" cy="5250269"/>
+            <wp:effectExtent t="0" r="0" b="0" l="0"/>
+            <wp:docPr id="609" name="" descr="" title=""/>
+            <wp:cNvGraphicFramePr>
+              <a:graphicFrameLocks xmlns:a="http://schemas.openxmlformats.org/drawingml/2006/main" noChangeAspect="1"/>
+            </wp:cNvGraphicFramePr>
+            <a:graphic xmlns:a="http://schemas.openxmlformats.org/drawingml/2006/main">
+              <a:graphicData uri="http://schemas.openxmlformats.org/drawingml/2006/picture">
+                <pic:pic xmlns:pic="http://schemas.openxmlformats.org/drawingml/2006/picture">
+                  <pic:nvPicPr>
+                    <pic:cNvPr id="0" name="" descr=""/>
+                    <pic:cNvPicPr>
+                      <a:picLocks noChangeAspect="1" noChangeArrowheads="1"/>
+                    </pic:cNvPicPr>
+                  </pic:nvPicPr>
+                  <pic:blipFill>
+                    <a:blip r:embed="rId206" cstate="none"/>
+                    <a:srcRect/>
+                    <a:stretch>
+                      <a:fillRect/>
+                    </a:stretch>
+                  </pic:blipFill>
+                  <pic:spPr bwMode="auto">
+                    <a:xfrm>
+                      <a:off x="0" y="0"/>
+                      <a:ext cx="7863840" cy="5250269"/>
+                    </a:xfrm>
+                    <a:prstGeom prst="rect">
+                      <a:avLst/>
+                    </a:prstGeom>
+                  </pic:spPr>
+                </pic:pic>
+              </a:graphicData>
+            </a:graphic>
+          </wp:inline>
+        </w:drawing>
+      </w:r>
+    </w:p>
+    <w:p>
+      <w:pPr>
+        <w:spacing w:after="280" w:line="260"/>
+        <w:jc w:val="left"/>
+      </w:pPr>
+      <w:r>
+        <w:rPr>
+          <w:rFonts w:ascii="Calibri" w:cs="Bangla MN" w:hAnsi="Calibri"/>
+          <w:b/>
+          <w:bCs/>
+          <w:color w:val="101E21"/>
+          <w:sz w:val="18"/>
+          <w:szCs w:val="18"/>
+        </w:rPr>
+        <w:t xml:space="preserve">চিত্র ৪ — /admin/stats।</w:t>
+      </w:r>
+      <w:r>
+        <w:rPr>
+          <w:rFonts w:ascii="Calibri" w:cs="Bangla MN" w:hAnsi="Calibri"/>
+          <w:color w:val="4A5D60"/>
+          <w:sz w:val="18"/>
+          <w:szCs w:val="18"/>
+        </w:rPr>
+        <w:t xml:space="preserve"> মোট ও delivered পার্সেল, in-flight, courier ছাড়া, গত সাত দিনের সৃষ্টি, delivery rate, গড় ডেলিভারি সময়, status ও ভূমিকা অনুযায়ী ভাগ, এবং সবচেয়ে ব্যস্ত এলাকা — প্রতিটি সংখ্যা database-এ গণনা করা, কোনোটিই memory-তে নয়।</w:t>
+      </w:r>
+    </w:p>
+    <w:p>
+      <w:pPr>
+        <w:pStyle w:val="Heading2"/>
+        <w:spacing w:after="140" w:before="300"/>
+      </w:pPr>
+      <w:r>
+        <w:rPr>
+          <w:rFonts w:ascii="Calibri" w:cs="Bangla MN" w:hAnsi="Calibri"/>
+          <w:b/>
+          <w:bCs/>
+          <w:color w:val="101E21"/>
+          <w:sz w:val="24"/>
+          <w:szCs w:val="24"/>
+        </w:rPr>
+        <w:t xml:space="preserve">নিয়মগুলো ইন্টারফেসেও একইরকম</w:t>
+      </w:r>
+    </w:p>
+    <w:tbl>
+      <w:tblPr>
+        <w:tblW w:type="dxa" w:w="14340"/>
+        <w:jc w:val="center"/>
+        <w:tblBorders>
+          <w:top w:val="none" w:sz="0"/>
+          <w:left w:val="none" w:sz="0"/>
+          <w:bottom w:val="none" w:sz="0"/>
+          <w:right w:val="none" w:sz="0"/>
+          <w:insideH w:val="none" w:sz="0"/>
+          <w:insideV w:val="none" w:sz="0"/>
+        </w:tblBorders>
+      </w:tblPr>
+      <w:tblGrid>
+        <w:gridCol w:w="7170"/>
+        <w:gridCol w:w="7170"/>
+      </w:tblGrid>
+      <w:tr>
+        <w:tc>
+          <w:tcPr>
+            <w:tcW w:type="dxa" w:w="7170"/>
+            <w:tcMar>
+              <w:top w:type="dxa" w:w="40"/>
+              <w:left w:type="dxa" w:w="60"/>
+              <w:bottom w:type="dxa" w:w="40"/>
+              <w:right w:type="dxa" w:w="60"/>
+            </w:tcMar>
+          </w:tcPr>
+          <w:p>
+            <w:pPr>
+              <w:spacing w:after="60" w:before="60"/>
+              <w:jc w:val="center"/>
+            </w:pPr>
+            <w:r>
+              <w:drawing>
+                <wp:inline distT="0" distB="0" distL="0" distR="0">
+                  <wp:extent cx="4206240" cy="2806403"/>
+                  <wp:effectExtent t="0" r="0" b="0" l="0"/>
+                  <wp:docPr id="610" name="" descr="" title=""/>
+                  <wp:cNvGraphicFramePr>
+                    <a:graphicFrameLocks xmlns:a="http://schemas.openxmlformats.org/drawingml/2006/main" noChangeAspect="1"/>
+                  </wp:cNvGraphicFramePr>
+                  <a:graphic xmlns:a="http://schemas.openxmlformats.org/drawingml/2006/main">
+                    <a:graphicData uri="http://schemas.openxmlformats.org/drawingml/2006/picture">
+                      <pic:pic xmlns:pic="http://schemas.openxmlformats.org/drawingml/2006/picture">
+                        <pic:nvPicPr>
+                          <pic:cNvPr id="0" name="" descr=""/>
+                          <pic:cNvPicPr>
+                            <a:picLocks noChangeAspect="1" noChangeArrowheads="1"/>
+                          </pic:cNvPicPr>
+                        </pic:nvPicPr>
+                        <pic:blipFill>
+                          <a:blip r:embed="rId209" cstate="none"/>
+                          <a:srcRect/>
+                          <a:stretch>
+                            <a:fillRect/>
+                          </a:stretch>
+                        </pic:blipFill>
+                        <pic:spPr bwMode="auto">
+                          <a:xfrm>
+                            <a:off x="0" y="0"/>
+                            <a:ext cx="4206240" cy="2806403"/>
+                          </a:xfrm>
+                          <a:prstGeom prst="rect">
+                            <a:avLst/>
+                          </a:prstGeom>
+                        </pic:spPr>
+                      </pic:pic>
+                    </a:graphicData>
+                  </a:graphic>
+                </wp:inline>
+              </w:drawing>
+            </w:r>
+          </w:p>
+          <w:p>
+            <w:pPr>
+              <w:spacing w:after="60" w:line="260"/>
+              <w:jc w:val="left"/>
+            </w:pPr>
+            <w:r>
+              <w:rPr>
+                <w:rFonts w:ascii="Calibri" w:cs="Bangla MN" w:hAnsi="Calibri"/>
+                <w:b/>
+                <w:bCs/>
+                <w:color w:val="101E21"/>
+                <w:sz w:val="18"/>
+                <w:szCs w:val="18"/>
+              </w:rPr>
+              <w:t xml:space="preserve">সাইন-ইন।</w:t>
+            </w:r>
+            <w:r>
+              <w:rPr>
+                <w:rFonts w:ascii="Calibri" w:cs="Bangla MN" w:hAnsi="Calibri"/>
+                <w:color w:val="4A5D60"/>
+                <w:sz w:val="18"/>
+                <w:szCs w:val="18"/>
+              </w:rPr>
+              <w:t xml:space="preserve"> Seed করা তিনটি ডেমো অ্যাকাউন্ট পাতাতেই দেওয়া আছে, যাতে যাচাই করতে আলাদা কিছু খুঁজতে না হয়।</w:t>
+            </w:r>
+          </w:p>
+        </w:tc>
+        <w:tc>
+          <w:tcPr>
+            <w:tcW w:type="dxa" w:w="7170"/>
+            <w:tcMar>
+              <w:top w:type="dxa" w:w="40"/>
+              <w:left w:type="dxa" w:w="60"/>
+              <w:bottom w:type="dxa" w:w="40"/>
+              <w:right w:type="dxa" w:w="60"/>
+            </w:tcMar>
+          </w:tcPr>
+          <w:p>
+            <w:pPr>
+              <w:spacing w:after="60" w:before="60"/>
+              <w:jc w:val="center"/>
+            </w:pPr>
+            <w:r>
+              <w:drawing>
+                <wp:inline distT="0" distB="0" distL="0" distR="0">
+                  <wp:extent cx="4206240" cy="1595006"/>
+                  <wp:effectExtent t="0" r="0" b="0" l="0"/>
+                  <wp:docPr id="611" name="" descr="" title=""/>
+                  <wp:cNvGraphicFramePr>
+                    <a:graphicFrameLocks xmlns:a="http://schemas.openxmlformats.org/drawingml/2006/main" noChangeAspect="1"/>
+                  </wp:cNvGraphicFramePr>
+                  <a:graphic xmlns:a="http://schemas.openxmlformats.org/drawingml/2006/main">
+                    <a:graphicData uri="http://schemas.openxmlformats.org/drawingml/2006/picture">
+                      <pic:pic xmlns:pic="http://schemas.openxmlformats.org/drawingml/2006/picture">
+                        <pic:nvPicPr>
+                          <pic:cNvPr id="0" name="" descr=""/>
+                          <pic:cNvPicPr>
+                            <a:picLocks noChangeAspect="1" noChangeArrowheads="1"/>
+                          </pic:cNvPicPr>
+                        </pic:nvPicPr>
+                        <pic:blipFill>
+                          <a:blip r:embed="rId210" cstate="none"/>
+                          <a:srcRect/>
+                          <a:stretch>
+                            <a:fillRect/>
+                          </a:stretch>
+                        </pic:blipFill>
+                        <pic:spPr bwMode="auto">
+                          <a:xfrm>
+                            <a:off x="0" y="0"/>
+                            <a:ext cx="4206240" cy="1595006"/>
+                          </a:xfrm>
+                          <a:prstGeom prst="rect">
+                            <a:avLst/>
+                          </a:prstGeom>
+                        </pic:spPr>
+                      </pic:pic>
+                    </a:graphicData>
+                  </a:graphic>
+                </wp:inline>
+              </w:drawing>
+            </w:r>
+          </w:p>
+          <w:p>
+            <w:pPr>
+              <w:spacing w:after="60" w:line="260"/>
+              <w:jc w:val="left"/>
+            </w:pPr>
+            <w:r>
+              <w:rPr>
+                <w:rFonts w:ascii="Calibri" w:cs="Bangla MN" w:hAnsi="Calibri"/>
+                <w:b/>
+                <w:bCs/>
+                <w:color w:val="101E21"/>
+                <w:sz w:val="18"/>
+                <w:szCs w:val="18"/>
+              </w:rPr>
+              <w:t xml:space="preserve">Scope-এর বাইরে মানে ৪০৪।</w:t>
+            </w:r>
+            <w:r>
+              <w:rPr>
+                <w:rFonts w:ascii="Calibri" w:cs="Bangla MN" w:hAnsi="Calibri"/>
+                <w:color w:val="4A5D60"/>
+                <w:sz w:val="18"/>
+                <w:szCs w:val="18"/>
+              </w:rPr>
+              <w:t xml:space="preserve"> একজন customer অন্যের tracking code সরাসরি URL-এ বসালে 403 নয়, 404 আসে — row-টি query থেকেই বের হয় না, তাই সেটির অস্তিত্ব আছে কি না তাও ফাঁস হয় না।</w:t>
+            </w:r>
+          </w:p>
+        </w:tc>
+      </w:tr>
+    </w:tbl>
+    <w:p>
+      <w:pPr>
+        <w:spacing w:after="200"/>
+      </w:pPr>
+    </w:p>
+    <w:p>
+      <w:pPr>
+        <w:pStyle w:val="Heading2"/>
+        <w:spacing w:after="140" w:before="300"/>
+      </w:pPr>
+      <w:r>
+        <w:rPr>
+          <w:rFonts w:ascii="Calibri" w:cs="Bangla MN" w:hAnsi="Calibri"/>
+          <w:b/>
+          <w:bCs/>
+          <w:color w:val="101E21"/>
+          <w:sz w:val="24"/>
+          <w:szCs w:val="24"/>
+        </w:rPr>
+        <w:t xml:space="preserve">ছোট পর্দা ও dark theme</w:t>
+      </w:r>
+    </w:p>
+    <w:tbl>
+      <w:tblPr>
+        <w:tblW w:type="dxa" w:w="14340"/>
+        <w:jc w:val="center"/>
+        <w:tblBorders>
+          <w:top w:val="none" w:sz="0"/>
+          <w:left w:val="none" w:sz="0"/>
+          <w:bottom w:val="none" w:sz="0"/>
+          <w:right w:val="none" w:sz="0"/>
+          <w:insideH w:val="none" w:sz="0"/>
+          <w:insideV w:val="none" w:sz="0"/>
+        </w:tblBorders>
+      </w:tblPr>
+      <w:tblGrid>
+        <w:gridCol w:w="7170"/>
+        <w:gridCol w:w="7170"/>
+      </w:tblGrid>
+      <w:tr>
+        <w:tc>
+          <w:tcPr>
+            <w:tcW w:type="dxa" w:w="7170"/>
+            <w:tcMar>
+              <w:top w:type="dxa" w:w="40"/>
+              <w:left w:type="dxa" w:w="60"/>
+              <w:bottom w:type="dxa" w:w="40"/>
+              <w:right w:type="dxa" w:w="60"/>
+            </w:tcMar>
+          </w:tcPr>
+          <w:p>
+            <w:pPr>
+              <w:spacing w:after="60" w:before="60"/>
+              <w:jc w:val="center"/>
+            </w:pPr>
+            <w:r>
+              <w:drawing>
+                <wp:inline distT="0" distB="0" distL="0" distR="0">
+                  <wp:extent cx="2286000" cy="4562202"/>
+                  <wp:effectExtent t="0" r="0" b="0" l="0"/>
+                  <wp:docPr id="612" name="" descr="" title=""/>
+                  <wp:cNvGraphicFramePr>
+                    <a:graphicFrameLocks xmlns:a="http://schemas.openxmlformats.org/drawingml/2006/main" noChangeAspect="1"/>
+                  </wp:cNvGraphicFramePr>
+                  <a:graphic xmlns:a="http://schemas.openxmlformats.org/drawingml/2006/main">
+                    <a:graphicData uri="http://schemas.openxmlformats.org/drawingml/2006/picture">
+                      <pic:pic xmlns:pic="http://schemas.openxmlformats.org/drawingml/2006/picture">
+                        <pic:nvPicPr>
+                          <pic:cNvPr id="0" name="" descr=""/>
+                          <pic:cNvPicPr>
+                            <a:picLocks noChangeAspect="1" noChangeArrowheads="1"/>
+                          </pic:cNvPicPr>
+                        </pic:nvPicPr>
+                        <pic:blipFill>
+                          <a:blip r:embed="rId212" cstate="none"/>
+                          <a:srcRect/>
+                          <a:stretch>
+                            <a:fillRect/>
+                          </a:stretch>
+                        </pic:blipFill>
+                        <pic:spPr bwMode="auto">
+                          <a:xfrm>
+                            <a:off x="0" y="0"/>
+                            <a:ext cx="2286000" cy="4562202"/>
+                          </a:xfrm>
+                          <a:prstGeom prst="rect">
+                            <a:avLst/>
+                          </a:prstGeom>
+                        </pic:spPr>
+                      </pic:pic>
+                    </a:graphicData>
+                  </a:graphic>
+                </wp:inline>
+              </w:drawing>
+            </w:r>
+          </w:p>
+          <w:p>
+            <w:pPr>
+              <w:spacing w:after="60" w:line="260"/>
+              <w:jc w:val="left"/>
+            </w:pPr>
+            <w:r>
+              <w:rPr>
+                <w:rFonts w:ascii="Calibri" w:cs="Bangla MN" w:hAnsi="Calibri"/>
+                <w:b/>
+                <w:bCs/>
+                <w:color w:val="101E21"/>
+                <w:sz w:val="18"/>
+                <w:szCs w:val="18"/>
+              </w:rPr>
+              <w:t xml:space="preserve">৩৯০px।</w:t>
+            </w:r>
+            <w:r>
+              <w:rPr>
+                <w:rFonts w:ascii="Calibri" w:cs="Bangla MN" w:hAnsi="Calibri"/>
+                <w:color w:val="4A5D60"/>
+                <w:sz w:val="18"/>
+                <w:szCs w:val="18"/>
+              </w:rPr>
+              <w:t xml:space="preserve"> একই dashboard, এক কলামে।</w:t>
+            </w:r>
+          </w:p>
+        </w:tc>
+        <w:tc>
+          <w:tcPr>
+            <w:tcW w:type="dxa" w:w="7170"/>
+            <w:tcMar>
+              <w:top w:type="dxa" w:w="40"/>
+              <w:left w:type="dxa" w:w="60"/>
+              <w:bottom w:type="dxa" w:w="40"/>
+              <w:right w:type="dxa" w:w="60"/>
+            </w:tcMar>
+          </w:tcPr>
+          <w:p>
+            <w:pPr>
+              <w:spacing w:after="60" w:before="60"/>
+              <w:jc w:val="center"/>
+            </w:pPr>
+            <w:r>
+              <w:drawing>
+                <wp:inline distT="0" distB="0" distL="0" distR="0">
+                  <wp:extent cx="2286000" cy="4562202"/>
+                  <wp:effectExtent t="0" r="0" b="0" l="0"/>
+                  <wp:docPr id="613" name="" descr="" title=""/>
+                  <wp:cNvGraphicFramePr>
+                    <a:graphicFrameLocks xmlns:a="http://schemas.openxmlformats.org/drawingml/2006/main" noChangeAspect="1"/>
+                  </wp:cNvGraphicFramePr>
+                  <a:graphic xmlns:a="http://schemas.openxmlformats.org/drawingml/2006/main">
+                    <a:graphicData uri="http://schemas.openxmlformats.org/drawingml/2006/picture">
+                      <pic:pic xmlns:pic="http://schemas.openxmlformats.org/drawingml/2006/picture">
+                        <pic:nvPicPr>
+                          <pic:cNvPr id="0" name="" descr=""/>
+                          <pic:cNvPicPr>
+                            <a:picLocks noChangeAspect="1" noChangeArrowheads="1"/>
+                          </pic:cNvPicPr>
+                        </pic:nvPicPr>
+                        <pic:blipFill>
+                          <a:blip r:embed="rId213" cstate="none"/>
+                          <a:srcRect/>
+                          <a:stretch>
+                            <a:fillRect/>
+                          </a:stretch>
+                        </pic:blipFill>
+                        <pic:spPr bwMode="auto">
+                          <a:xfrm>
+                            <a:off x="0" y="0"/>
+                            <a:ext cx="2286000" cy="4562202"/>
+                          </a:xfrm>
+                          <a:prstGeom prst="rect">
+                            <a:avLst/>
+                          </a:prstGeom>
+                        </pic:spPr>
+                      </pic:pic>
+                    </a:graphicData>
+                  </a:graphic>
+                </wp:inline>
+              </w:drawing>
+            </w:r>
+          </w:p>
+          <w:p>
+            <w:pPr>
+              <w:spacing w:after="60" w:line="260"/>
+              <w:jc w:val="left"/>
+            </w:pPr>
+            <w:r>
+              <w:rPr>
+                <w:rFonts w:ascii="Calibri" w:cs="Bangla MN" w:hAnsi="Calibri"/>
+                <w:b/>
+                <w:bCs/>
+                <w:color w:val="101E21"/>
+                <w:sz w:val="18"/>
+                <w:szCs w:val="18"/>
+              </w:rPr>
+              <w:t xml:space="preserve">ইতিহাস, মোবাইলে।</w:t>
+            </w:r>
+            <w:r>
+              <w:rPr>
+                <w:rFonts w:ascii="Calibri" w:cs="Bangla MN" w:hAnsi="Calibri"/>
+                <w:color w:val="4A5D60"/>
+                <w:sz w:val="18"/>
+                <w:szCs w:val="18"/>
+              </w:rPr>
+              <w:t xml:space="preserve"> একই append-only trail।</w:t>
+            </w:r>
+          </w:p>
+        </w:tc>
+      </w:tr>
+    </w:tbl>
+    <w:p>
+      <w:pPr>
+        <w:spacing w:after="200"/>
+      </w:pPr>
+    </w:p>
+    <w:p>
+      <w:pPr>
+        <w:spacing w:after="100" w:before="200"/>
+        <w:jc w:val="center"/>
+      </w:pPr>
+      <w:r>
+        <w:drawing>
+          <wp:inline distT="0" distB="0" distL="0" distR="0">
+            <wp:extent cx="7863840" cy="5250269"/>
+            <wp:effectExtent t="0" r="0" b="0" l="0"/>
+            <wp:docPr id="614" name="" descr="" title=""/>
+            <wp:cNvGraphicFramePr>
+              <a:graphicFrameLocks xmlns:a="http://schemas.openxmlformats.org/drawingml/2006/main" noChangeAspect="1"/>
+            </wp:cNvGraphicFramePr>
+            <a:graphic xmlns:a="http://schemas.openxmlformats.org/drawingml/2006/main">
+              <a:graphicData uri="http://schemas.openxmlformats.org/drawingml/2006/picture">
+                <pic:pic xmlns:pic="http://schemas.openxmlformats.org/drawingml/2006/picture">
+                  <pic:nvPicPr>
+                    <pic:cNvPr id="0" name="" descr=""/>
+                    <pic:cNvPicPr>
+                      <a:picLocks noChangeAspect="1" noChangeArrowheads="1"/>
+                    </pic:cNvPicPr>
+                  </pic:nvPicPr>
+                  <pic:blipFill>
+                    <a:blip r:embed="rId211" cstate="none"/>
+                    <a:srcRect/>
+                    <a:stretch>
+                      <a:fillRect/>
+                    </a:stretch>
+                  </pic:blipFill>
+                  <pic:spPr bwMode="auto">
+                    <a:xfrm>
+                      <a:off x="0" y="0"/>
+                      <a:ext cx="7863840" cy="5250269"/>
+                    </a:xfrm>
+                    <a:prstGeom prst="rect">
+                      <a:avLst/>
+                    </a:prstGeom>
+                  </pic:spPr>
+                </pic:pic>
+              </a:graphicData>
+            </a:graphic>
+          </wp:inline>
+        </w:drawing>
+      </w:r>
+    </w:p>
+    <w:p>
+      <w:pPr>
+        <w:spacing w:after="280" w:line="260"/>
+        <w:jc w:val="left"/>
+      </w:pPr>
+      <w:r>
+        <w:rPr>
+          <w:rFonts w:ascii="Calibri" w:cs="Bangla MN" w:hAnsi="Calibri"/>
+          <w:b/>
+          <w:bCs/>
+          <w:color w:val="101E21"/>
+          <w:sz w:val="18"/>
+          <w:szCs w:val="18"/>
+        </w:rPr>
+        <w:t xml:space="preserve">চিত্র ৫ — dark theme।</w:t>
+      </w:r>
+      <w:r>
+        <w:rPr>
+          <w:rFonts w:ascii="Calibri" w:cs="Bangla MN" w:hAnsi="Calibri"/>
+          <w:color w:val="4A5D60"/>
+          <w:sz w:val="18"/>
+          <w:szCs w:val="18"/>
+        </w:rPr>
+        <w:t xml:space="preserve"> পছন্দটি প্রথম paint-এর আগেই প্রয়োগ হয়, তাই dark mode-এ পাতা রিলোড করলে সাদা ঝলকানি দেখা যায় না।</w:t>
+      </w:r>
+    </w:p>
+    <w:p>
+      <w:pPr>
+        <w:keepNext/>
+        <w:spacing w:after="40" w:before="360"/>
+      </w:pPr>
+      <w:r>
+        <w:rPr>
+          <w:rFonts w:ascii="Consolas" w:cs="Bangla MN" w:hAnsi="Consolas"/>
+          <w:b/>
+          <w:bCs/>
+          <w:color w:val="0C6360"/>
+          <w:spacing w:val="30"/>
+          <w:sz w:val="16"/>
+          <w:szCs w:val="16"/>
+        </w:rPr>
+        <w:t xml:space="preserve">০৫ / ARCHITECTURE</w:t>
       </w:r>
     </w:p>
     <w:p>
@@ -2092,7 +3482,7 @@
           <w:sz w:val="16"/>
           <w:szCs w:val="16"/>
         </w:rPr>
-        <w:t xml:space="preserve">০৫ / DATA MODEL</w:t>
+        <w:t xml:space="preserve">০৬ / DATA MODEL</w:t>
       </w:r>
     </w:p>
     <w:p>
@@ -2305,7 +3695,7 @@
           <w:sz w:val="16"/>
           <w:szCs w:val="16"/>
         </w:rPr>
-        <w:t xml:space="preserve">০৬ / REFERENCE</w:t>
+        <w:t xml:space="preserve">০৭ / REFERENCE</w:t>
       </w:r>
     </w:p>
     <w:p>
@@ -6952,7 +8342,7 @@
           <w:sz w:val="16"/>
           <w:szCs w:val="16"/>
         </w:rPr>
-        <w:t xml:space="preserve">০৭ / PROBLEMS SOLVED</w:t>
+        <w:t xml:space="preserve">০৮ / PROBLEMS SOLVED</w:t>
       </w:r>
     </w:p>
     <w:p>
@@ -8973,7 +10363,7 @@
           <w:sz w:val="16"/>
           <w:szCs w:val="16"/>
         </w:rPr>
-        <w:t xml:space="preserve">০৮ / STACK</w:t>
+        <w:t xml:space="preserve">০৯ / STACK</w:t>
       </w:r>
     </w:p>
     <w:p>
@@ -10976,7 +12366,7 @@
           <w:sz w:val="16"/>
           <w:szCs w:val="16"/>
         </w:rPr>
-        <w:t xml:space="preserve">০৯ / ROADMAP</w:t>
+        <w:t xml:space="preserve">১০ / ROADMAP</w:t>
       </w:r>
     </w:p>
     <w:p>

</xml_diff>